<commit_message>
added files to advanced
</commit_message>
<xml_diff>
--- a/Advanced/AdvancedGitConcepts.docx
+++ b/Advanced/AdvancedGitConcepts.docx
@@ -44,21 +44,7 @@
         <w:rPr>
           <w:rFonts w:ascii="Times New Roman" w:hAnsi="Times New Roman" w:cs="Times New Roman"/>
         </w:rPr>
-        <w:t xml:space="preserve">climb the ranks of understanding in our journey to master Git, we start developing better </w:t>
-      </w:r>
-      <w:proofErr w:type="gramStart"/>
-      <w:r>
-        <w:rPr>
-          <w:rFonts w:ascii="Times New Roman" w:hAnsi="Times New Roman" w:cs="Times New Roman"/>
-        </w:rPr>
-        <w:t>work flows</w:t>
-      </w:r>
-      <w:proofErr w:type="gramEnd"/>
-      <w:r>
-        <w:rPr>
-          <w:rFonts w:ascii="Times New Roman" w:hAnsi="Times New Roman" w:cs="Times New Roman"/>
-        </w:rPr>
-        <w:t xml:space="preserve"> for our own projects, as well as creating a structure that allows collaboration with multiple team-mates and how to weave our individual contributions into a much larger piece of fabric. </w:t>
+        <w:t xml:space="preserve">climb the ranks of understanding in our journey to master Git, we start developing better work flows for our own projects, as well as creating a structure that allows collaboration with multiple team-mates and how to weave our individual contributions into a much larger piece of fabric. </w:t>
       </w:r>
     </w:p>
     <w:p>
@@ -93,19 +79,7 @@
         <w:rPr>
           <w:rFonts w:ascii="Times New Roman" w:hAnsi="Times New Roman" w:cs="Times New Roman"/>
         </w:rPr>
-        <w:t xml:space="preserve">Well, if we remember back to the common terminology that was discussed in the introduction to Git, a branch is simply </w:t>
-      </w:r>
-      <w:r>
-        <w:rPr>
-          <w:rFonts w:ascii="Times New Roman" w:hAnsi="Times New Roman" w:cs="Times New Roman"/>
-        </w:rPr>
-        <w:t>a line of development for a project</w:t>
-      </w:r>
-      <w:r>
-        <w:rPr>
-          <w:rFonts w:ascii="Times New Roman" w:hAnsi="Times New Roman" w:cs="Times New Roman"/>
-        </w:rPr>
-        <w:t>.</w:t>
+        <w:t>Well, if we remember back to the common terminology that was discussed in the introduction to Git, a branch is simply a line of development for a project.</w:t>
       </w:r>
       <w:r>
         <w:rPr>
@@ -150,8 +124,455 @@
         <w:rPr>
           <w:rFonts w:ascii="Times New Roman" w:hAnsi="Times New Roman" w:cs="Times New Roman"/>
         </w:rPr>
-        <w:t>Feature</w:t>
-      </w:r>
+        <w:t>Feature Development</w:t>
+      </w:r>
+    </w:p>
+    <w:p>
+      <w:pPr>
+        <w:rPr>
+          <w:rFonts w:ascii="Times New Roman" w:hAnsi="Times New Roman" w:cs="Times New Roman"/>
+        </w:rPr>
+      </w:pPr>
+      <w:r>
+        <w:rPr>
+          <w:rFonts w:ascii="Times New Roman" w:hAnsi="Times New Roman" w:cs="Times New Roman"/>
+        </w:rPr>
+        <w:t xml:space="preserve">To understand feature development, we first must define and understand what a feature is. A feature is a “catch all term” that we use to denote a section of development or work. Features are meant to be kept relatively small in scope to accomplish one or potentially two goals of the project. This structure allows for less overlapping contributions which reduces the chances that we create merge conflicts (which we will cover soon), reduced rework, a more efficient </w:t>
+      </w:r>
+      <w:proofErr w:type="gramStart"/>
+      <w:r>
+        <w:rPr>
+          <w:rFonts w:ascii="Times New Roman" w:hAnsi="Times New Roman" w:cs="Times New Roman"/>
+        </w:rPr>
+        <w:t>work flow</w:t>
+      </w:r>
+      <w:proofErr w:type="gramEnd"/>
+      <w:r>
+        <w:rPr>
+          <w:rFonts w:ascii="Times New Roman" w:hAnsi="Times New Roman" w:cs="Times New Roman"/>
+        </w:rPr>
+        <w:t xml:space="preserve"> while in a group and most importantly, a history of changes being made including a “reset point” should anything go wrong with our project tracking.</w:t>
+      </w:r>
+    </w:p>
+    <w:p>
+      <w:pPr>
+        <w:rPr>
+          <w:rFonts w:ascii="Times New Roman" w:hAnsi="Times New Roman" w:cs="Times New Roman"/>
+        </w:rPr>
+      </w:pPr>
+      <w:r>
+        <w:rPr>
+          <w:rFonts w:ascii="Times New Roman" w:hAnsi="Times New Roman" w:cs="Times New Roman"/>
+        </w:rPr>
+        <w:t>Projects are made up of many features, and typically we don’t want to do our creation of work in the main/ master branch, but instead in small branches that stem from the main/master branch. This way we can create, test, modify, and perfect our work before trying to integrate our work back into the main branch. Think of it as creating little sandboxes for each feature of work, that we get to play in and develop or work towards and finalize that feature work before we take a screenshot of it and merging it back into the “final work in progress product.”</w:t>
+      </w:r>
+    </w:p>
+    <w:p>
+      <w:pPr>
+        <w:rPr>
+          <w:rFonts w:ascii="Times New Roman" w:hAnsi="Times New Roman" w:cs="Times New Roman"/>
+        </w:rPr>
+      </w:pPr>
+    </w:p>
+    <w:p>
+      <w:pPr>
+        <w:rPr>
+          <w:rFonts w:ascii="Times New Roman" w:hAnsi="Times New Roman" w:cs="Times New Roman"/>
+        </w:rPr>
+      </w:pPr>
+    </w:p>
+    <w:p>
+      <w:pPr>
+        <w:rPr>
+          <w:rFonts w:ascii="Times New Roman" w:hAnsi="Times New Roman" w:cs="Times New Roman"/>
+        </w:rPr>
+      </w:pPr>
+    </w:p>
+    <w:p>
+      <w:pPr>
+        <w:pStyle w:val="Heading1"/>
+        <w:rPr>
+          <w:rFonts w:ascii="Times New Roman" w:hAnsi="Times New Roman" w:cs="Times New Roman"/>
+        </w:rPr>
+      </w:pPr>
+      <w:r>
+        <w:rPr>
+          <w:rFonts w:ascii="Times New Roman" w:hAnsi="Times New Roman" w:cs="Times New Roman"/>
+        </w:rPr>
+        <w:lastRenderedPageBreak/>
+        <w:t>Merging Branches</w:t>
+      </w:r>
+    </w:p>
+    <w:p>
+      <w:pPr>
+        <w:rPr>
+          <w:rFonts w:ascii="Times New Roman" w:hAnsi="Times New Roman" w:cs="Times New Roman"/>
+        </w:rPr>
+      </w:pPr>
+      <w:r>
+        <w:rPr>
+          <w:rFonts w:ascii="Times New Roman" w:hAnsi="Times New Roman" w:cs="Times New Roman"/>
+        </w:rPr>
+        <w:t xml:space="preserve">What is a merge? Well, that’s easy, a merge is combining changes from one branch </w:t>
+      </w:r>
+      <w:proofErr w:type="gramStart"/>
+      <w:r>
+        <w:rPr>
+          <w:rFonts w:ascii="Times New Roman" w:hAnsi="Times New Roman" w:cs="Times New Roman"/>
+        </w:rPr>
+        <w:t>into</w:t>
+      </w:r>
+      <w:proofErr w:type="gramEnd"/>
+      <w:r>
+        <w:rPr>
+          <w:rFonts w:ascii="Times New Roman" w:hAnsi="Times New Roman" w:cs="Times New Roman"/>
+        </w:rPr>
+        <w:t xml:space="preserve"> another branch! </w:t>
+      </w:r>
+      <w:r>
+        <w:rPr>
+          <w:rFonts w:ascii="Times New Roman" w:hAnsi="Times New Roman" w:cs="Times New Roman"/>
+        </w:rPr>
+        <w:t>Think of main as the official project, a branch as your personal workspace, and merging as copying your finished work back into the official project once it's been tested and reviewed.</w:t>
+      </w:r>
+      <w:r>
+        <w:rPr>
+          <w:rFonts w:ascii="Times New Roman" w:hAnsi="Times New Roman" w:cs="Times New Roman"/>
+        </w:rPr>
+        <w:t xml:space="preserve"> As an example, </w:t>
+      </w:r>
+      <w:proofErr w:type="gramStart"/>
+      <w:r>
+        <w:rPr>
+          <w:rFonts w:ascii="Times New Roman" w:hAnsi="Times New Roman" w:cs="Times New Roman"/>
+        </w:rPr>
+        <w:t>Suppose</w:t>
+      </w:r>
+      <w:proofErr w:type="gramEnd"/>
+      <w:r>
+        <w:rPr>
+          <w:rFonts w:ascii="Times New Roman" w:hAnsi="Times New Roman" w:cs="Times New Roman"/>
+        </w:rPr>
+        <w:t xml:space="preserve"> your project initially </w:t>
+      </w:r>
+      <w:r>
+        <w:rPr>
+          <w:rFonts w:ascii="Times New Roman" w:hAnsi="Times New Roman" w:cs="Times New Roman"/>
+        </w:rPr>
+        <w:t>is setup like this:</w:t>
+      </w:r>
+    </w:p>
+    <w:p>
+      <w:pPr>
+        <w:rPr>
+          <w:rFonts w:ascii="Times New Roman" w:hAnsi="Times New Roman" w:cs="Times New Roman"/>
+        </w:rPr>
+      </w:pPr>
+      <w:r>
+        <w:rPr>
+          <w:rFonts w:ascii="Times New Roman" w:hAnsi="Times New Roman" w:cs="Times New Roman"/>
+        </w:rPr>
+        <w:t xml:space="preserve">In the Main </w:t>
+      </w:r>
+      <w:r>
+        <w:rPr>
+          <w:rFonts w:ascii="Times New Roman" w:hAnsi="Times New Roman" w:cs="Times New Roman"/>
+        </w:rPr>
+        <w:t>b</w:t>
+      </w:r>
+      <w:r>
+        <w:rPr>
+          <w:rFonts w:ascii="Times New Roman" w:hAnsi="Times New Roman" w:cs="Times New Roman"/>
+        </w:rPr>
+        <w:t>ranch you have: Home Page, Login Page, and an About page.</w:t>
+      </w:r>
+    </w:p>
+    <w:p>
+      <w:pPr>
+        <w:rPr>
+          <w:rFonts w:ascii="Times New Roman" w:hAnsi="Times New Roman" w:cs="Times New Roman"/>
+        </w:rPr>
+      </w:pPr>
+      <w:r>
+        <w:rPr>
+          <w:rFonts w:ascii="Times New Roman" w:hAnsi="Times New Roman" w:cs="Times New Roman"/>
+        </w:rPr>
+        <w:t>You create a new branch called Dev and it h</w:t>
+      </w:r>
+      <w:r>
+        <w:rPr>
+          <w:rFonts w:ascii="Times New Roman" w:hAnsi="Times New Roman" w:cs="Times New Roman"/>
+        </w:rPr>
+        <w:t>as all the same contents as the Main branch did at the time of branch creation.</w:t>
+      </w:r>
+    </w:p>
+    <w:p>
+      <w:pPr>
+        <w:rPr>
+          <w:rFonts w:ascii="Times New Roman" w:hAnsi="Times New Roman" w:cs="Times New Roman"/>
+        </w:rPr>
+      </w:pPr>
+      <w:r>
+        <w:rPr>
+          <w:rFonts w:ascii="Times New Roman" w:hAnsi="Times New Roman" w:cs="Times New Roman"/>
+        </w:rPr>
+        <w:t>Now you work in the Dev branch and create a new file called Dashboard. Now the contents of the Main branch and Dev branch differ! So now that you have finished all your work and testing on the new file (Dashboard) in the branch Dev, we want to make sure it is included in our Main branch. So how do we do this?</w:t>
+      </w:r>
+    </w:p>
+    <w:p>
+      <w:pPr>
+        <w:rPr>
+          <w:rFonts w:ascii="Times New Roman" w:hAnsi="Times New Roman" w:cs="Times New Roman"/>
+        </w:rPr>
+      </w:pPr>
+      <w:r>
+        <w:rPr>
+          <w:rFonts w:ascii="Times New Roman" w:hAnsi="Times New Roman" w:cs="Times New Roman"/>
+        </w:rPr>
+        <w:t>Through Merging!</w:t>
+      </w:r>
+    </w:p>
+    <w:p>
+      <w:pPr>
+        <w:rPr>
+          <w:rFonts w:ascii="Times New Roman" w:hAnsi="Times New Roman" w:cs="Times New Roman"/>
+        </w:rPr>
+      </w:pPr>
+      <w:r>
+        <w:rPr>
+          <w:rFonts w:ascii="Times New Roman" w:hAnsi="Times New Roman" w:cs="Times New Roman"/>
+        </w:rPr>
+        <w:t>What Happens During a Merge?</w:t>
+      </w:r>
+    </w:p>
+    <w:p>
+      <w:pPr>
+        <w:rPr>
+          <w:rFonts w:ascii="Times New Roman" w:hAnsi="Times New Roman" w:cs="Times New Roman"/>
+        </w:rPr>
+      </w:pPr>
+      <w:r>
+        <w:rPr>
+          <w:rFonts w:ascii="Times New Roman" w:hAnsi="Times New Roman" w:cs="Times New Roman"/>
+        </w:rPr>
+        <w:t>When you merge dev into main, Git compares the two branches</w:t>
+      </w:r>
+      <w:r>
+        <w:rPr>
+          <w:rFonts w:ascii="Times New Roman" w:hAnsi="Times New Roman" w:cs="Times New Roman"/>
+        </w:rPr>
+        <w:t>, notices that the difference between the branches is the new file, Dashboard, so it copies that change into the Main branch. However, it should be stated that Git does not copy everything, it only copies the difference between the branches.</w:t>
+      </w:r>
+    </w:p>
+    <w:p>
+      <w:pPr>
+        <w:rPr>
+          <w:rFonts w:ascii="Times New Roman" w:hAnsi="Times New Roman" w:cs="Times New Roman"/>
+        </w:rPr>
+      </w:pPr>
+      <w:r>
+        <w:rPr>
+          <w:rFonts w:ascii="Times New Roman" w:hAnsi="Times New Roman" w:cs="Times New Roman"/>
+        </w:rPr>
+        <w:t xml:space="preserve">Now we ask, </w:t>
+      </w:r>
+      <w:r>
+        <w:rPr>
+          <w:rFonts w:ascii="Times New Roman" w:hAnsi="Times New Roman" w:cs="Times New Roman"/>
+        </w:rPr>
+        <w:t>Why Merge Instead of Working Directly on Main?</w:t>
+      </w:r>
+    </w:p>
+    <w:p>
+      <w:pPr>
+        <w:rPr>
+          <w:rFonts w:ascii="Times New Roman" w:hAnsi="Times New Roman" w:cs="Times New Roman"/>
+        </w:rPr>
+      </w:pPr>
+      <w:r>
+        <w:rPr>
+          <w:rFonts w:ascii="Times New Roman" w:hAnsi="Times New Roman" w:cs="Times New Roman"/>
+        </w:rPr>
+        <w:t>Well, the easiest way to put it is, working</w:t>
+      </w:r>
+      <w:r>
+        <w:rPr>
+          <w:rFonts w:ascii="Times New Roman" w:hAnsi="Times New Roman" w:cs="Times New Roman"/>
+        </w:rPr>
+        <w:t xml:space="preserve"> directly on main is risky because everyone shares it.</w:t>
+      </w:r>
+    </w:p>
+    <w:p>
+      <w:pPr>
+        <w:rPr>
+          <w:rFonts w:ascii="Times New Roman" w:hAnsi="Times New Roman" w:cs="Times New Roman"/>
+        </w:rPr>
+      </w:pPr>
+      <w:r>
+        <w:rPr>
+          <w:rFonts w:ascii="Times New Roman" w:hAnsi="Times New Roman" w:cs="Times New Roman"/>
+        </w:rPr>
+        <w:t>Instead, developers:</w:t>
+      </w:r>
+    </w:p>
+    <w:p>
+      <w:pPr>
+        <w:numPr>
+          <w:ilvl w:val="0"/>
+          <w:numId w:val="1"/>
+        </w:numPr>
+        <w:rPr>
+          <w:rFonts w:ascii="Times New Roman" w:hAnsi="Times New Roman" w:cs="Times New Roman"/>
+        </w:rPr>
+      </w:pPr>
+      <w:r>
+        <w:rPr>
+          <w:rFonts w:ascii="Times New Roman" w:hAnsi="Times New Roman" w:cs="Times New Roman"/>
+        </w:rPr>
+        <w:t xml:space="preserve">Create a </w:t>
+      </w:r>
+      <w:r>
+        <w:rPr>
+          <w:rFonts w:ascii="Times New Roman" w:hAnsi="Times New Roman" w:cs="Times New Roman"/>
+        </w:rPr>
+        <w:t xml:space="preserve">development </w:t>
+      </w:r>
+      <w:r>
+        <w:rPr>
+          <w:rFonts w:ascii="Times New Roman" w:hAnsi="Times New Roman" w:cs="Times New Roman"/>
+        </w:rPr>
+        <w:t xml:space="preserve">branch. </w:t>
+      </w:r>
+    </w:p>
+    <w:p>
+      <w:pPr>
+        <w:numPr>
+          <w:ilvl w:val="0"/>
+          <w:numId w:val="1"/>
+        </w:numPr>
+        <w:rPr>
+          <w:rFonts w:ascii="Times New Roman" w:hAnsi="Times New Roman" w:cs="Times New Roman"/>
+        </w:rPr>
+      </w:pPr>
+      <w:r>
+        <w:rPr>
+          <w:rFonts w:ascii="Times New Roman" w:hAnsi="Times New Roman" w:cs="Times New Roman"/>
+        </w:rPr>
+        <w:t>Make and test changes safely</w:t>
+      </w:r>
+      <w:r>
+        <w:rPr>
+          <w:rFonts w:ascii="Times New Roman" w:hAnsi="Times New Roman" w:cs="Times New Roman"/>
+        </w:rPr>
+        <w:t xml:space="preserve"> in the development branch.</w:t>
+      </w:r>
+    </w:p>
+    <w:p>
+      <w:pPr>
+        <w:numPr>
+          <w:ilvl w:val="0"/>
+          <w:numId w:val="1"/>
+        </w:numPr>
+        <w:rPr>
+          <w:rFonts w:ascii="Times New Roman" w:hAnsi="Times New Roman" w:cs="Times New Roman"/>
+        </w:rPr>
+      </w:pPr>
+      <w:r>
+        <w:rPr>
+          <w:rFonts w:ascii="Times New Roman" w:hAnsi="Times New Roman" w:cs="Times New Roman"/>
+        </w:rPr>
+        <w:t xml:space="preserve">Merge only when everything works. </w:t>
+      </w:r>
+    </w:p>
+    <w:p>
+      <w:pPr>
+        <w:rPr>
+          <w:rFonts w:ascii="Times New Roman" w:hAnsi="Times New Roman" w:cs="Times New Roman"/>
+        </w:rPr>
+      </w:pPr>
+      <w:r>
+        <w:rPr>
+          <w:rFonts w:ascii="Times New Roman" w:hAnsi="Times New Roman" w:cs="Times New Roman"/>
+        </w:rPr>
+        <w:t>This keeps the main branch stable and working.</w:t>
+      </w:r>
+    </w:p>
+    <w:p>
+      <w:pPr>
+        <w:rPr>
+          <w:rFonts w:ascii="Times New Roman" w:hAnsi="Times New Roman" w:cs="Times New Roman"/>
+        </w:rPr>
+      </w:pPr>
+    </w:p>
+    <w:p>
+      <w:pPr>
+        <w:rPr>
+          <w:rFonts w:ascii="Times New Roman" w:hAnsi="Times New Roman" w:cs="Times New Roman"/>
+        </w:rPr>
+      </w:pPr>
+    </w:p>
+    <w:p>
+      <w:pPr>
+        <w:rPr>
+          <w:rFonts w:ascii="Times New Roman" w:hAnsi="Times New Roman" w:cs="Times New Roman"/>
+        </w:rPr>
+      </w:pPr>
+    </w:p>
+    <w:p>
+      <w:pPr>
+        <w:rPr>
+          <w:rFonts w:ascii="Times New Roman" w:hAnsi="Times New Roman" w:cs="Times New Roman"/>
+        </w:rPr>
+      </w:pPr>
+    </w:p>
+    <w:p>
+      <w:pPr>
+        <w:rPr>
+          <w:rFonts w:ascii="Times New Roman" w:hAnsi="Times New Roman" w:cs="Times New Roman"/>
+        </w:rPr>
+      </w:pPr>
+    </w:p>
+    <w:p>
+      <w:pPr>
+        <w:pStyle w:val="Heading1"/>
+        <w:rPr>
+          <w:rFonts w:ascii="Times New Roman" w:hAnsi="Times New Roman" w:cs="Times New Roman"/>
+        </w:rPr>
+      </w:pPr>
+      <w:r>
+        <w:rPr>
+          <w:rFonts w:ascii="Times New Roman" w:hAnsi="Times New Roman" w:cs="Times New Roman"/>
+        </w:rPr>
+        <w:lastRenderedPageBreak/>
+        <w:t>Advanced Conflict Resolution</w:t>
+      </w:r>
+    </w:p>
+    <w:p>
+      <w:pPr>
+        <w:rPr>
+          <w:rFonts w:ascii="Times New Roman" w:hAnsi="Times New Roman" w:cs="Times New Roman"/>
+        </w:rPr>
+      </w:pPr>
+      <w:r>
+        <w:rPr>
+          <w:rFonts w:ascii="Times New Roman" w:hAnsi="Times New Roman" w:cs="Times New Roman"/>
+        </w:rPr>
+        <w:t>Once you understand what a merge is, conflict resolution is the next major Git skill. A conflict occurs when Git can't automatically decide which changes to keep.</w:t>
+      </w:r>
+      <w:r>
+        <w:rPr>
+          <w:rFonts w:ascii="Times New Roman" w:hAnsi="Times New Roman" w:cs="Times New Roman"/>
+        </w:rPr>
+        <w:t xml:space="preserve"> As an example, imagine two people edit the same file and edit the same line of code, private String direction = “North</w:t>
+      </w:r>
+      <w:proofErr w:type="gramStart"/>
+      <w:r>
+        <w:rPr>
+          <w:rFonts w:ascii="Times New Roman" w:hAnsi="Times New Roman" w:cs="Times New Roman"/>
+        </w:rPr>
+        <w:t>”;.</w:t>
+      </w:r>
+      <w:proofErr w:type="gramEnd"/>
       <w:r>
         <w:rPr>
           <w:rFonts w:ascii="Times New Roman" w:hAnsi="Times New Roman" w:cs="Times New Roman"/>
@@ -162,57 +583,708 @@
         <w:rPr>
           <w:rFonts w:ascii="Times New Roman" w:hAnsi="Times New Roman" w:cs="Times New Roman"/>
         </w:rPr>
-        <w:t>Development</w:t>
-      </w:r>
-    </w:p>
-    <w:p>
-      <w:pPr>
-        <w:rPr>
-          <w:rFonts w:ascii="Times New Roman" w:hAnsi="Times New Roman" w:cs="Times New Roman"/>
-        </w:rPr>
-      </w:pPr>
-      <w:r>
-        <w:rPr>
-          <w:rFonts w:ascii="Times New Roman" w:hAnsi="Times New Roman" w:cs="Times New Roman"/>
-        </w:rPr>
-        <w:t xml:space="preserve">To understand feature development, we first must define and understand what a feature is. A feature is a “catch all term” that we use to denote a section of development or work. Features are meant to be kept relatively small in scope to accomplish one or potentially two goals of the project. This structure allows for less overlapping contributions which reduces the chances that we create merge conflicts (which we will cover soon), reduced rework, a more efficient </w:t>
+        <w:t xml:space="preserve">The first person to edit it changes it to </w:t>
+      </w:r>
+      <w:r>
+        <w:rPr>
+          <w:rFonts w:ascii="Times New Roman" w:hAnsi="Times New Roman" w:cs="Times New Roman"/>
+        </w:rPr>
+        <w:t>private String direction = “</w:t>
+      </w:r>
+      <w:r>
+        <w:rPr>
+          <w:rFonts w:ascii="Times New Roman" w:hAnsi="Times New Roman" w:cs="Times New Roman"/>
+        </w:rPr>
+        <w:t>South</w:t>
+      </w:r>
+      <w:r>
+        <w:rPr>
+          <w:rFonts w:ascii="Times New Roman" w:hAnsi="Times New Roman" w:cs="Times New Roman"/>
+        </w:rPr>
+        <w:t>”;</w:t>
+      </w:r>
+      <w:r>
+        <w:rPr>
+          <w:rFonts w:ascii="Times New Roman" w:hAnsi="Times New Roman" w:cs="Times New Roman"/>
+        </w:rPr>
+        <w:t xml:space="preserve"> but the second person to edit it changes it to </w:t>
+      </w:r>
+      <w:r>
+        <w:rPr>
+          <w:rFonts w:ascii="Times New Roman" w:hAnsi="Times New Roman" w:cs="Times New Roman"/>
+        </w:rPr>
+        <w:t>private String direction = “</w:t>
+      </w:r>
+      <w:r>
+        <w:rPr>
+          <w:rFonts w:ascii="Times New Roman" w:hAnsi="Times New Roman" w:cs="Times New Roman"/>
+        </w:rPr>
+        <w:t>East</w:t>
+      </w:r>
+      <w:r>
+        <w:rPr>
+          <w:rFonts w:ascii="Times New Roman" w:hAnsi="Times New Roman" w:cs="Times New Roman"/>
+        </w:rPr>
+        <w:t>”;</w:t>
+      </w:r>
+    </w:p>
+    <w:p>
+      <w:pPr>
+        <w:rPr>
+          <w:rFonts w:ascii="Times New Roman" w:hAnsi="Times New Roman" w:cs="Times New Roman"/>
+        </w:rPr>
+      </w:pPr>
+      <w:r>
+        <w:rPr>
+          <w:rFonts w:ascii="Times New Roman" w:hAnsi="Times New Roman" w:cs="Times New Roman"/>
+        </w:rPr>
+        <w:t xml:space="preserve">When you merge, Git can’t guess which direction it is supposed to be, so it creates a Merge conflict, that requires manual intervention to resolve. During a Merge </w:t>
       </w:r>
       <w:proofErr w:type="gramStart"/>
       <w:r>
         <w:rPr>
           <w:rFonts w:ascii="Times New Roman" w:hAnsi="Times New Roman" w:cs="Times New Roman"/>
         </w:rPr>
-        <w:t>work flow</w:t>
+        <w:t>conflict</w:t>
       </w:r>
       <w:proofErr w:type="gramEnd"/>
       <w:r>
         <w:rPr>
           <w:rFonts w:ascii="Times New Roman" w:hAnsi="Times New Roman" w:cs="Times New Roman"/>
         </w:rPr>
-        <w:t xml:space="preserve"> while in a group and most importantly, a history of changes being made including a “reset point” should anything go wrong with our project tracking.</w:t>
-      </w:r>
-    </w:p>
-    <w:p>
-      <w:pPr>
-        <w:rPr>
-          <w:rFonts w:ascii="Times New Roman" w:hAnsi="Times New Roman" w:cs="Times New Roman"/>
-        </w:rPr>
-      </w:pPr>
-      <w:r>
-        <w:rPr>
-          <w:rFonts w:ascii="Times New Roman" w:hAnsi="Times New Roman" w:cs="Times New Roman"/>
-        </w:rPr>
-        <w:t>Projects are made up of many features, and typically we don’t want to do our creation of work in the main/ master branch, but instead in small branches that stem from the main/master branch. This way we can create, test, modify, and perfect our work before trying to integrate our work back into the main branch. Think of it as creating little sandboxes for each feature of work, that we get to play in and develop or work towards and finalize that feature work before we take a screenshot of it and merging it back into the “final work in progress product.”</w:t>
-      </w:r>
-    </w:p>
-    <w:p>
-      <w:pPr>
-        <w:rPr>
-          <w:rFonts w:ascii="Times New Roman" w:hAnsi="Times New Roman" w:cs="Times New Roman"/>
-        </w:rPr>
-      </w:pPr>
-    </w:p>
-    <w:p/>
+        <w:t xml:space="preserve"> you must indicate to Git what file version you </w:t>
+      </w:r>
+      <w:proofErr w:type="gramStart"/>
+      <w:r>
+        <w:rPr>
+          <w:rFonts w:ascii="Times New Roman" w:hAnsi="Times New Roman" w:cs="Times New Roman"/>
+        </w:rPr>
+        <w:t>actually want</w:t>
+      </w:r>
+      <w:proofErr w:type="gramEnd"/>
+      <w:r>
+        <w:rPr>
+          <w:rFonts w:ascii="Times New Roman" w:hAnsi="Times New Roman" w:cs="Times New Roman"/>
+        </w:rPr>
+        <w:t xml:space="preserve"> to keep, which is done by editing the file of the version you want. The Merge conflict is typically denoted by the indicators &lt;&lt;&lt;&lt;&lt;&lt;Head, =======, and &gt;&gt;&gt;&gt;&gt;dev. </w:t>
+      </w:r>
+      <w:r>
+        <w:rPr>
+          <w:rFonts w:ascii="Times New Roman" w:hAnsi="Times New Roman" w:cs="Times New Roman"/>
+        </w:rPr>
+        <w:t>&lt;&lt;&lt;&lt;&lt;&lt;Head</w:t>
+      </w:r>
+      <w:r>
+        <w:rPr>
+          <w:rFonts w:ascii="Times New Roman" w:hAnsi="Times New Roman" w:cs="Times New Roman"/>
+        </w:rPr>
+        <w:t xml:space="preserve"> describes the current branch (typically main or master)</w:t>
+      </w:r>
+      <w:r>
+        <w:rPr>
+          <w:rFonts w:ascii="Times New Roman" w:hAnsi="Times New Roman" w:cs="Times New Roman"/>
+        </w:rPr>
+        <w:t xml:space="preserve">, ======= denotes a separator, and &gt;&gt;&gt;&gt;&gt;Dev describes the incoming changes from the Dev branch. Spotting these indicators is a quick way of telling where the merge conflict </w:t>
+      </w:r>
+      <w:proofErr w:type="gramStart"/>
+      <w:r>
+        <w:rPr>
+          <w:rFonts w:ascii="Times New Roman" w:hAnsi="Times New Roman" w:cs="Times New Roman"/>
+        </w:rPr>
+        <w:t>actually exists</w:t>
+      </w:r>
+      <w:proofErr w:type="gramEnd"/>
+      <w:r>
+        <w:rPr>
+          <w:rFonts w:ascii="Times New Roman" w:hAnsi="Times New Roman" w:cs="Times New Roman"/>
+        </w:rPr>
+        <w:t xml:space="preserve"> within the files attempting to be merged.</w:t>
+      </w:r>
+    </w:p>
+    <w:p>
+      <w:pPr>
+        <w:rPr>
+          <w:rFonts w:ascii="Times New Roman" w:hAnsi="Times New Roman" w:cs="Times New Roman"/>
+        </w:rPr>
+      </w:pPr>
+      <w:r>
+        <w:rPr>
+          <w:rFonts w:ascii="Times New Roman" w:hAnsi="Times New Roman" w:cs="Times New Roman"/>
+        </w:rPr>
+        <w:t xml:space="preserve">There are a few other advanced conflict situations that can occur when working within Git with other collaborators. A few we will review are as such: Delete vs Modify, </w:t>
+      </w:r>
+      <w:proofErr w:type="gramStart"/>
+      <w:r>
+        <w:rPr>
+          <w:rFonts w:ascii="Times New Roman" w:hAnsi="Times New Roman" w:cs="Times New Roman"/>
+        </w:rPr>
+        <w:t>Rename</w:t>
+      </w:r>
+      <w:proofErr w:type="gramEnd"/>
+      <w:r>
+        <w:rPr>
+          <w:rFonts w:ascii="Times New Roman" w:hAnsi="Times New Roman" w:cs="Times New Roman"/>
+        </w:rPr>
+        <w:t xml:space="preserve"> conflicts, File Moved, and Binary Files. Delete vs Modify is when a file is deleted in the main branch but edited in a dev branch. Git </w:t>
+      </w:r>
+      <w:proofErr w:type="gramStart"/>
+      <w:r>
+        <w:rPr>
+          <w:rFonts w:ascii="Times New Roman" w:hAnsi="Times New Roman" w:cs="Times New Roman"/>
+        </w:rPr>
+        <w:t>cant</w:t>
+      </w:r>
+      <w:proofErr w:type="gramEnd"/>
+      <w:r>
+        <w:rPr>
+          <w:rFonts w:ascii="Times New Roman" w:hAnsi="Times New Roman" w:cs="Times New Roman"/>
+        </w:rPr>
+        <w:t xml:space="preserve"> determine if the file is supposed to exist or not, so you must manually tell Git to either keep the file, delete it, or move its changes somewhere else. For Rename Conflicts, they typically occur when a file is renamed in main to something else, simultaneously in dev the file is renamed to something else than what it is called in the main branch. </w:t>
+      </w:r>
+      <w:r>
+        <w:rPr>
+          <w:rFonts w:ascii="Times New Roman" w:hAnsi="Times New Roman" w:cs="Times New Roman"/>
+        </w:rPr>
+        <w:t>Git can't determine the intended new name</w:t>
+      </w:r>
+      <w:r>
+        <w:rPr>
+          <w:rFonts w:ascii="Times New Roman" w:hAnsi="Times New Roman" w:cs="Times New Roman"/>
+        </w:rPr>
+        <w:t>, so it must be manually indicated. For File Moved conflicts, when the file itself i</w:t>
+      </w:r>
+      <w:r>
+        <w:rPr>
+          <w:rFonts w:ascii="Times New Roman" w:hAnsi="Times New Roman" w:cs="Times New Roman"/>
+        </w:rPr>
+        <w:t>s</w:t>
+      </w:r>
+      <w:r>
+        <w:rPr>
+          <w:rFonts w:ascii="Times New Roman" w:hAnsi="Times New Roman" w:cs="Times New Roman"/>
+        </w:rPr>
+        <w:t xml:space="preserve"> moved in main, to a different directory path</w:t>
+      </w:r>
+      <w:r>
+        <w:rPr>
+          <w:rFonts w:ascii="Times New Roman" w:hAnsi="Times New Roman" w:cs="Times New Roman"/>
+        </w:rPr>
+        <w:t xml:space="preserve"> than the original, but the original file is edited in the dev branch, in the original directory path, </w:t>
+      </w:r>
+      <w:r>
+        <w:rPr>
+          <w:rFonts w:ascii="Times New Roman" w:hAnsi="Times New Roman" w:cs="Times New Roman"/>
+        </w:rPr>
+        <w:t xml:space="preserve">Git needs help deciding where the edits </w:t>
+      </w:r>
+      <w:proofErr w:type="gramStart"/>
+      <w:r>
+        <w:rPr>
+          <w:rFonts w:ascii="Times New Roman" w:hAnsi="Times New Roman" w:cs="Times New Roman"/>
+        </w:rPr>
+        <w:t>belong</w:t>
+      </w:r>
+      <w:r>
+        <w:rPr>
+          <w:rFonts w:ascii="Times New Roman" w:hAnsi="Times New Roman" w:cs="Times New Roman"/>
+        </w:rPr>
+        <w:t>, and</w:t>
+      </w:r>
+      <w:proofErr w:type="gramEnd"/>
+      <w:r>
+        <w:rPr>
+          <w:rFonts w:ascii="Times New Roman" w:hAnsi="Times New Roman" w:cs="Times New Roman"/>
+        </w:rPr>
+        <w:t xml:space="preserve"> must be manually indicated. When it comes to Images, PDF’s, and Word documents, they typically </w:t>
+      </w:r>
+      <w:proofErr w:type="gramStart"/>
+      <w:r>
+        <w:rPr>
+          <w:rFonts w:ascii="Times New Roman" w:hAnsi="Times New Roman" w:cs="Times New Roman"/>
+        </w:rPr>
+        <w:t>cant</w:t>
+      </w:r>
+      <w:proofErr w:type="gramEnd"/>
+      <w:r>
+        <w:rPr>
+          <w:rFonts w:ascii="Times New Roman" w:hAnsi="Times New Roman" w:cs="Times New Roman"/>
+        </w:rPr>
+        <w:t xml:space="preserve"> be merged line by line, so if both branches modify an image, such as logo.png, Git </w:t>
+      </w:r>
+      <w:proofErr w:type="gramStart"/>
+      <w:r>
+        <w:rPr>
+          <w:rFonts w:ascii="Times New Roman" w:hAnsi="Times New Roman" w:cs="Times New Roman"/>
+        </w:rPr>
+        <w:t>cant</w:t>
+      </w:r>
+      <w:proofErr w:type="gramEnd"/>
+      <w:r>
+        <w:rPr>
+          <w:rFonts w:ascii="Times New Roman" w:hAnsi="Times New Roman" w:cs="Times New Roman"/>
+        </w:rPr>
+        <w:t xml:space="preserve"> combine the image changes automatically, and throws a merge conflict, so you must indicate which logo.png image you want to keep. </w:t>
+      </w:r>
+    </w:p>
+    <w:p>
+      <w:pPr>
+        <w:rPr>
+          <w:rFonts w:ascii="Times New Roman" w:hAnsi="Times New Roman" w:cs="Times New Roman"/>
+        </w:rPr>
+      </w:pPr>
+      <w:r>
+        <w:rPr>
+          <w:rFonts w:ascii="Times New Roman" w:hAnsi="Times New Roman" w:cs="Times New Roman"/>
+        </w:rPr>
+        <w:t>A few tips and tricks that should help keep the merge conflicts at bay are as follows:</w:t>
+      </w:r>
+    </w:p>
+    <w:p>
+      <w:pPr>
+        <w:pStyle w:val="ListParagraph"/>
+        <w:numPr>
+          <w:ilvl w:val="0"/>
+          <w:numId w:val="2"/>
+        </w:numPr>
+        <w:rPr>
+          <w:rFonts w:ascii="Times New Roman" w:hAnsi="Times New Roman" w:cs="Times New Roman"/>
+        </w:rPr>
+      </w:pPr>
+      <w:r>
+        <w:rPr>
+          <w:rFonts w:ascii="Times New Roman" w:hAnsi="Times New Roman" w:cs="Times New Roman"/>
+        </w:rPr>
+        <w:t xml:space="preserve">Pull frequently to stay up to date. </w:t>
+      </w:r>
+    </w:p>
+    <w:p>
+      <w:pPr>
+        <w:pStyle w:val="ListParagraph"/>
+        <w:numPr>
+          <w:ilvl w:val="0"/>
+          <w:numId w:val="2"/>
+        </w:numPr>
+        <w:rPr>
+          <w:rFonts w:ascii="Times New Roman" w:hAnsi="Times New Roman" w:cs="Times New Roman"/>
+        </w:rPr>
+      </w:pPr>
+      <w:r>
+        <w:rPr>
+          <w:rFonts w:ascii="Times New Roman" w:hAnsi="Times New Roman" w:cs="Times New Roman"/>
+        </w:rPr>
+        <w:t xml:space="preserve">Keep branches short-lived. The longer a branch exists, the more likely it is to conflict. </w:t>
+      </w:r>
+    </w:p>
+    <w:p>
+      <w:pPr>
+        <w:pStyle w:val="ListParagraph"/>
+        <w:numPr>
+          <w:ilvl w:val="0"/>
+          <w:numId w:val="2"/>
+        </w:numPr>
+        <w:rPr>
+          <w:rFonts w:ascii="Times New Roman" w:hAnsi="Times New Roman" w:cs="Times New Roman"/>
+        </w:rPr>
+      </w:pPr>
+      <w:r>
+        <w:rPr>
+          <w:rFonts w:ascii="Times New Roman" w:hAnsi="Times New Roman" w:cs="Times New Roman"/>
+        </w:rPr>
+        <w:t xml:space="preserve">Commit small, focused changes instead of huge batches. </w:t>
+      </w:r>
+    </w:p>
+    <w:p>
+      <w:pPr>
+        <w:pStyle w:val="ListParagraph"/>
+        <w:numPr>
+          <w:ilvl w:val="0"/>
+          <w:numId w:val="2"/>
+        </w:numPr>
+        <w:rPr>
+          <w:rFonts w:ascii="Times New Roman" w:hAnsi="Times New Roman" w:cs="Times New Roman"/>
+        </w:rPr>
+      </w:pPr>
+      <w:r>
+        <w:rPr>
+          <w:rFonts w:ascii="Times New Roman" w:hAnsi="Times New Roman" w:cs="Times New Roman"/>
+        </w:rPr>
+        <w:t xml:space="preserve">Communicate with teammates if you're working in the same files. </w:t>
+      </w:r>
+    </w:p>
+    <w:p>
+      <w:pPr>
+        <w:pStyle w:val="ListParagraph"/>
+        <w:numPr>
+          <w:ilvl w:val="0"/>
+          <w:numId w:val="2"/>
+        </w:numPr>
+        <w:rPr>
+          <w:rFonts w:ascii="Times New Roman" w:hAnsi="Times New Roman" w:cs="Times New Roman"/>
+        </w:rPr>
+      </w:pPr>
+      <w:r>
+        <w:rPr>
+          <w:rFonts w:ascii="Times New Roman" w:hAnsi="Times New Roman" w:cs="Times New Roman"/>
+        </w:rPr>
+        <w:t xml:space="preserve">Read every conflict carefully—don't automatically choose one side </w:t>
+      </w:r>
+      <w:proofErr w:type="gramStart"/>
+      <w:r>
+        <w:rPr>
+          <w:rFonts w:ascii="Times New Roman" w:hAnsi="Times New Roman" w:cs="Times New Roman"/>
+        </w:rPr>
+        <w:t>unless</w:t>
+      </w:r>
+      <w:proofErr w:type="gramEnd"/>
+      <w:r>
+        <w:rPr>
+          <w:rFonts w:ascii="Times New Roman" w:hAnsi="Times New Roman" w:cs="Times New Roman"/>
+        </w:rPr>
+        <w:t xml:space="preserve"> you're sure.</w:t>
+      </w:r>
+    </w:p>
+    <w:p>
+      <w:pPr>
+        <w:rPr>
+          <w:rFonts w:ascii="Times New Roman" w:hAnsi="Times New Roman" w:cs="Times New Roman"/>
+          <w:b/>
+          <w:bCs/>
+        </w:rPr>
+      </w:pPr>
+    </w:p>
+    <w:p>
+      <w:pPr>
+        <w:rPr>
+          <w:rFonts w:ascii="Times New Roman" w:hAnsi="Times New Roman" w:cs="Times New Roman"/>
+          <w:b/>
+          <w:bCs/>
+        </w:rPr>
+      </w:pPr>
+    </w:p>
+    <w:p>
+      <w:pPr>
+        <w:rPr>
+          <w:rFonts w:ascii="Times New Roman" w:hAnsi="Times New Roman" w:cs="Times New Roman"/>
+        </w:rPr>
+      </w:pPr>
+      <w:r>
+        <w:rPr>
+          <w:rFonts w:ascii="Times New Roman" w:hAnsi="Times New Roman" w:cs="Times New Roman"/>
+        </w:rPr>
+        <w:lastRenderedPageBreak/>
+        <w:t xml:space="preserve">If a conflict is simple, GitHub may let you resolve it </w:t>
+      </w:r>
+      <w:proofErr w:type="gramStart"/>
+      <w:r>
+        <w:rPr>
+          <w:rFonts w:ascii="Times New Roman" w:hAnsi="Times New Roman" w:cs="Times New Roman"/>
+        </w:rPr>
+        <w:t>in</w:t>
+      </w:r>
+      <w:proofErr w:type="gramEnd"/>
+      <w:r>
+        <w:rPr>
+          <w:rFonts w:ascii="Times New Roman" w:hAnsi="Times New Roman" w:cs="Times New Roman"/>
+        </w:rPr>
+        <w:t xml:space="preserve"> the web interface.</w:t>
+      </w:r>
+    </w:p>
+    <w:p>
+      <w:pPr>
+        <w:rPr>
+          <w:rFonts w:ascii="Times New Roman" w:hAnsi="Times New Roman" w:cs="Times New Roman"/>
+        </w:rPr>
+      </w:pPr>
+      <w:r>
+        <w:rPr>
+          <w:rFonts w:ascii="Times New Roman" w:hAnsi="Times New Roman" w:cs="Times New Roman"/>
+        </w:rPr>
+        <w:t>For larger conflicts, you'll usually:</w:t>
+      </w:r>
+    </w:p>
+    <w:p>
+      <w:pPr>
+        <w:numPr>
+          <w:ilvl w:val="0"/>
+          <w:numId w:val="4"/>
+        </w:numPr>
+        <w:spacing w:after="0"/>
+        <w:rPr>
+          <w:rFonts w:ascii="Times New Roman" w:hAnsi="Times New Roman" w:cs="Times New Roman"/>
+        </w:rPr>
+      </w:pPr>
+      <w:proofErr w:type="gramStart"/>
+      <w:r>
+        <w:rPr>
+          <w:rFonts w:ascii="Times New Roman" w:hAnsi="Times New Roman" w:cs="Times New Roman"/>
+        </w:rPr>
+        <w:t>Pull</w:t>
+      </w:r>
+      <w:proofErr w:type="gramEnd"/>
+      <w:r>
+        <w:rPr>
+          <w:rFonts w:ascii="Times New Roman" w:hAnsi="Times New Roman" w:cs="Times New Roman"/>
+        </w:rPr>
+        <w:t xml:space="preserve"> the latest changes locally. </w:t>
+      </w:r>
+    </w:p>
+    <w:p>
+      <w:pPr>
+        <w:numPr>
+          <w:ilvl w:val="0"/>
+          <w:numId w:val="4"/>
+        </w:numPr>
+        <w:spacing w:after="0"/>
+        <w:rPr>
+          <w:rFonts w:ascii="Times New Roman" w:hAnsi="Times New Roman" w:cs="Times New Roman"/>
+        </w:rPr>
+      </w:pPr>
+      <w:r>
+        <w:rPr>
+          <w:rFonts w:ascii="Times New Roman" w:hAnsi="Times New Roman" w:cs="Times New Roman"/>
+        </w:rPr>
+        <w:t xml:space="preserve">Merge (or rebase) the target branch into your branch. </w:t>
+      </w:r>
+    </w:p>
+    <w:p>
+      <w:pPr>
+        <w:numPr>
+          <w:ilvl w:val="0"/>
+          <w:numId w:val="4"/>
+        </w:numPr>
+        <w:spacing w:after="0"/>
+        <w:rPr>
+          <w:rFonts w:ascii="Times New Roman" w:hAnsi="Times New Roman" w:cs="Times New Roman"/>
+        </w:rPr>
+      </w:pPr>
+      <w:r>
+        <w:rPr>
+          <w:rFonts w:ascii="Times New Roman" w:hAnsi="Times New Roman" w:cs="Times New Roman"/>
+        </w:rPr>
+        <w:t xml:space="preserve">Resolve conflicts in your editor (VS Code, IntelliJ, Eclipse, etc.). </w:t>
+      </w:r>
+    </w:p>
+    <w:p>
+      <w:pPr>
+        <w:numPr>
+          <w:ilvl w:val="0"/>
+          <w:numId w:val="4"/>
+        </w:numPr>
+        <w:spacing w:after="0"/>
+        <w:rPr>
+          <w:rFonts w:ascii="Times New Roman" w:hAnsi="Times New Roman" w:cs="Times New Roman"/>
+        </w:rPr>
+      </w:pPr>
+      <w:r>
+        <w:rPr>
+          <w:rFonts w:ascii="Times New Roman" w:hAnsi="Times New Roman" w:cs="Times New Roman"/>
+        </w:rPr>
+        <w:t xml:space="preserve">Test your project to make sure it still works. </w:t>
+      </w:r>
+    </w:p>
+    <w:p>
+      <w:pPr>
+        <w:numPr>
+          <w:ilvl w:val="0"/>
+          <w:numId w:val="4"/>
+        </w:numPr>
+        <w:spacing w:after="0"/>
+        <w:rPr>
+          <w:rFonts w:ascii="Times New Roman" w:hAnsi="Times New Roman" w:cs="Times New Roman"/>
+        </w:rPr>
+      </w:pPr>
+      <w:r>
+        <w:rPr>
+          <w:rFonts w:ascii="Times New Roman" w:hAnsi="Times New Roman" w:cs="Times New Roman"/>
+        </w:rPr>
+        <w:t xml:space="preserve">Commit the resolution. </w:t>
+      </w:r>
+    </w:p>
+    <w:p>
+      <w:pPr>
+        <w:numPr>
+          <w:ilvl w:val="0"/>
+          <w:numId w:val="4"/>
+        </w:numPr>
+        <w:spacing w:after="0"/>
+        <w:rPr>
+          <w:rFonts w:ascii="Times New Roman" w:hAnsi="Times New Roman" w:cs="Times New Roman"/>
+        </w:rPr>
+      </w:pPr>
+      <w:r>
+        <w:rPr>
+          <w:rFonts w:ascii="Times New Roman" w:hAnsi="Times New Roman" w:cs="Times New Roman"/>
+        </w:rPr>
+        <w:t>Push the updated branch.</w:t>
+      </w:r>
+    </w:p>
+    <w:p>
+      <w:pPr>
+        <w:spacing w:after="0"/>
+        <w:ind w:left="720"/>
+        <w:rPr>
+          <w:rFonts w:ascii="Times New Roman" w:hAnsi="Times New Roman" w:cs="Times New Roman"/>
+        </w:rPr>
+      </w:pPr>
+    </w:p>
+    <w:p>
+      <w:pPr>
+        <w:spacing w:after="0"/>
+        <w:rPr>
+          <w:rFonts w:ascii="Times New Roman" w:hAnsi="Times New Roman" w:cs="Times New Roman"/>
+        </w:rPr>
+      </w:pPr>
+      <w:r>
+        <w:rPr>
+          <w:rFonts w:ascii="Times New Roman" w:hAnsi="Times New Roman" w:cs="Times New Roman"/>
+        </w:rPr>
+        <w:t>Merge vs. Rebase</w:t>
+      </w:r>
+    </w:p>
+    <w:p>
+      <w:pPr>
+        <w:spacing w:after="0"/>
+        <w:rPr>
+          <w:rFonts w:ascii="Times New Roman" w:hAnsi="Times New Roman" w:cs="Times New Roman"/>
+        </w:rPr>
+      </w:pPr>
+      <w:r>
+        <w:rPr>
+          <w:rFonts w:ascii="Times New Roman" w:hAnsi="Times New Roman" w:cs="Times New Roman"/>
+        </w:rPr>
+        <w:t>Both integrate changes from one branch into another, but they work differently:</w:t>
+      </w:r>
+    </w:p>
+    <w:p>
+      <w:pPr>
+        <w:numPr>
+          <w:ilvl w:val="0"/>
+          <w:numId w:val="5"/>
+        </w:numPr>
+        <w:spacing w:after="0"/>
+        <w:rPr>
+          <w:rFonts w:ascii="Times New Roman" w:hAnsi="Times New Roman" w:cs="Times New Roman"/>
+        </w:rPr>
+      </w:pPr>
+      <w:proofErr w:type="gramStart"/>
+      <w:r>
+        <w:rPr>
+          <w:rFonts w:ascii="Times New Roman" w:hAnsi="Times New Roman" w:cs="Times New Roman"/>
+        </w:rPr>
+        <w:t>Merge creates</w:t>
+      </w:r>
+      <w:proofErr w:type="gramEnd"/>
+      <w:r>
+        <w:rPr>
+          <w:rFonts w:ascii="Times New Roman" w:hAnsi="Times New Roman" w:cs="Times New Roman"/>
+        </w:rPr>
+        <w:t xml:space="preserve"> a new </w:t>
+      </w:r>
+      <w:proofErr w:type="gramStart"/>
+      <w:r>
+        <w:rPr>
+          <w:rFonts w:ascii="Times New Roman" w:hAnsi="Times New Roman" w:cs="Times New Roman"/>
+        </w:rPr>
+        <w:t>merge</w:t>
+      </w:r>
+      <w:proofErr w:type="gramEnd"/>
+      <w:r>
+        <w:rPr>
+          <w:rFonts w:ascii="Times New Roman" w:hAnsi="Times New Roman" w:cs="Times New Roman"/>
+        </w:rPr>
+        <w:t xml:space="preserve"> </w:t>
+      </w:r>
+      <w:proofErr w:type="gramStart"/>
+      <w:r>
+        <w:rPr>
+          <w:rFonts w:ascii="Times New Roman" w:hAnsi="Times New Roman" w:cs="Times New Roman"/>
+        </w:rPr>
+        <w:t>commit</w:t>
+      </w:r>
+      <w:proofErr w:type="gramEnd"/>
+      <w:r>
+        <w:rPr>
+          <w:rFonts w:ascii="Times New Roman" w:hAnsi="Times New Roman" w:cs="Times New Roman"/>
+        </w:rPr>
+        <w:t xml:space="preserve"> that ties the two branches together. It preserves the true history of what happened. </w:t>
+      </w:r>
+    </w:p>
+    <w:p>
+      <w:pPr>
+        <w:numPr>
+          <w:ilvl w:val="0"/>
+          <w:numId w:val="5"/>
+        </w:numPr>
+        <w:spacing w:after="0"/>
+        <w:rPr>
+          <w:rFonts w:ascii="Times New Roman" w:hAnsi="Times New Roman" w:cs="Times New Roman"/>
+        </w:rPr>
+      </w:pPr>
+      <w:r>
+        <w:rPr>
+          <w:rFonts w:ascii="Times New Roman" w:hAnsi="Times New Roman" w:cs="Times New Roman"/>
+        </w:rPr>
+        <w:t xml:space="preserve">Rebase moves your commits so they appear to have been created on top of the latest version of another branch. This creates a cleaner, more linear history but rewrites commit history. </w:t>
+      </w:r>
+    </w:p>
+    <w:p>
+      <w:pPr>
+        <w:spacing w:after="0"/>
+        <w:rPr>
+          <w:rFonts w:ascii="Times New Roman" w:hAnsi="Times New Roman" w:cs="Times New Roman"/>
+        </w:rPr>
+      </w:pPr>
+      <w:r>
+        <w:rPr>
+          <w:rFonts w:ascii="Times New Roman" w:hAnsi="Times New Roman" w:cs="Times New Roman"/>
+        </w:rPr>
+        <w:t>Many teams use:</w:t>
+      </w:r>
+    </w:p>
+    <w:p>
+      <w:pPr>
+        <w:numPr>
+          <w:ilvl w:val="0"/>
+          <w:numId w:val="6"/>
+        </w:numPr>
+        <w:spacing w:after="0"/>
+        <w:rPr>
+          <w:rFonts w:ascii="Times New Roman" w:hAnsi="Times New Roman" w:cs="Times New Roman"/>
+        </w:rPr>
+      </w:pPr>
+      <w:r>
+        <w:rPr>
+          <w:rFonts w:ascii="Times New Roman" w:hAnsi="Times New Roman" w:cs="Times New Roman"/>
+        </w:rPr>
+        <w:t xml:space="preserve">Merge for shared branches like main. </w:t>
+      </w:r>
+    </w:p>
+    <w:p>
+      <w:pPr>
+        <w:numPr>
+          <w:ilvl w:val="0"/>
+          <w:numId w:val="6"/>
+        </w:numPr>
+        <w:spacing w:after="0"/>
+        <w:rPr>
+          <w:rFonts w:ascii="Times New Roman" w:hAnsi="Times New Roman" w:cs="Times New Roman"/>
+        </w:rPr>
+      </w:pPr>
+      <w:r>
+        <w:rPr>
+          <w:rFonts w:ascii="Times New Roman" w:hAnsi="Times New Roman" w:cs="Times New Roman"/>
+        </w:rPr>
+        <w:t>Rebase on personal feature branches before opening a pull request (if the team's workflow allows it).</w:t>
+      </w:r>
+    </w:p>
+    <w:p>
+      <w:pPr>
+        <w:spacing w:after="0"/>
+        <w:rPr>
+          <w:rFonts w:ascii="Times New Roman" w:hAnsi="Times New Roman" w:cs="Times New Roman"/>
+        </w:rPr>
+      </w:pPr>
+    </w:p>
     <w:sectPr>
       <w:pgSz w:w="12240" w:h="15840"/>
       <w:pgMar w:top="1440" w:right="1440" w:bottom="1440" w:left="1440" w:header="720" w:footer="720" w:gutter="0"/>
@@ -221,6 +1293,782 @@
     </w:sectPr>
   </w:body>
 </w:document>
+</file>
+
+<file path=word/numbering.xml><?xml version="1.0" encoding="utf-8"?>
+<w:numbering xmlns:wpc="http://schemas.microsoft.com/office/word/2010/wordprocessingCanvas" xmlns:cx="http://schemas.microsoft.com/office/drawing/2014/chartex" xmlns:cx1="http://schemas.microsoft.com/office/drawing/2015/9/8/chartex" xmlns:cx2="http://schemas.microsoft.com/office/drawing/2015/10/21/chartex" xmlns:cx3="http://schemas.microsoft.com/office/drawing/2016/5/9/chartex" xmlns:cx4="http://schemas.microsoft.com/office/drawing/2016/5/10/chartex" xmlns:cx5="http://schemas.microsoft.com/office/drawing/2016/5/11/chartex" xmlns:cx6="http://schemas.microsoft.com/office/drawing/2016/5/12/chartex" xmlns:cx7="http://schemas.microsoft.com/office/drawing/2016/5/13/chartex" xmlns:cx8="http://schemas.microsoft.com/office/drawing/2016/5/14/chartex" xmlns:mc="http://schemas.openxmlformats.org/markup-compatibility/2006" xmlns:aink="http://schemas.microsoft.com/office/drawing/2016/ink" xmlns:am3d="http://schemas.microsoft.com/office/drawing/2017/model3d" xmlns:o="urn:schemas-microsoft-com:office:office" xmlns:oel="http://schemas.microsoft.com/office/2019/extlst" xmlns:r="http://schemas.openxmlformats.org/officeDocument/2006/relationships" xmlns:m="http://schemas.openxmlformats.org/officeDocument/2006/math" xmlns:v="urn:schemas-microsoft-com:vml" xmlns:wp14="http://schemas.microsoft.com/office/word/2010/wordprocessingDrawing" xmlns:wp="http://schemas.openxmlformats.org/drawingml/2006/wordprocessingDrawing" xmlns:w10="urn:schemas-microsoft-com:office:word" xmlns:w="http://schemas.openxmlformats.org/wordprocessingml/2006/main" xmlns:w14="http://schemas.microsoft.com/office/word/2010/wordml" xmlns:w15="http://schemas.microsoft.com/office/word/2012/wordml" xmlns:w16cex="http://schemas.microsoft.com/office/word/2018/wordml/cex" xmlns:w16cid="http://schemas.microsoft.com/office/word/2016/wordml/cid" xmlns:w16="http://schemas.microsoft.com/office/word/2018/wordml" xmlns:w16du="http://schemas.microsoft.com/office/word/2023/wordml/word16du" xmlns:w16sdtdh="http://schemas.microsoft.com/office/word/2020/wordml/sdtdatahash" xmlns:w16sdtfl="http://schemas.microsoft.com/office/word/2024/wordml/sdtformatlock" xmlns:w16se="http://schemas.microsoft.com/office/word/2015/wordml/symex" xmlns:wpg="http://schemas.microsoft.com/office/word/2010/wordprocessingGroup" xmlns:wpi="http://schemas.microsoft.com/office/word/2010/wordprocessingInk" xmlns:wne="http://schemas.microsoft.com/office/word/2006/wordml" xmlns:wps="http://schemas.microsoft.com/office/word/2010/wordprocessingShape" mc:Ignorable="w14 w15 w16se w16cid w16 w16cex w16sdtdh w16sdtfl w16du wp14">
+  <w:abstractNum w:abstractNumId="0" w15:restartNumberingAfterBreak="0">
+    <w:nsid w:val="022E5587"/>
+    <w:multiLevelType w:val="multilevel"/>
+    <w:tmpl w:val="C7B4C28A"/>
+    <w:lvl w:ilvl="0">
+      <w:start w:val="1"/>
+      <w:numFmt w:val="decimal"/>
+      <w:lvlText w:val="%1."/>
+      <w:lvlJc w:val="left"/>
+      <w:pPr>
+        <w:tabs>
+          <w:tab w:val="num" w:pos="720"/>
+        </w:tabs>
+        <w:ind w:left="720" w:hanging="360"/>
+      </w:pPr>
+    </w:lvl>
+    <w:lvl w:ilvl="1" w:tentative="1">
+      <w:start w:val="1"/>
+      <w:numFmt w:val="decimal"/>
+      <w:lvlText w:val="%2."/>
+      <w:lvlJc w:val="left"/>
+      <w:pPr>
+        <w:tabs>
+          <w:tab w:val="num" w:pos="1440"/>
+        </w:tabs>
+        <w:ind w:left="1440" w:hanging="360"/>
+      </w:pPr>
+    </w:lvl>
+    <w:lvl w:ilvl="2" w:tentative="1">
+      <w:start w:val="1"/>
+      <w:numFmt w:val="decimal"/>
+      <w:lvlText w:val="%3."/>
+      <w:lvlJc w:val="left"/>
+      <w:pPr>
+        <w:tabs>
+          <w:tab w:val="num" w:pos="2160"/>
+        </w:tabs>
+        <w:ind w:left="2160" w:hanging="360"/>
+      </w:pPr>
+    </w:lvl>
+    <w:lvl w:ilvl="3" w:tentative="1">
+      <w:start w:val="1"/>
+      <w:numFmt w:val="decimal"/>
+      <w:lvlText w:val="%4."/>
+      <w:lvlJc w:val="left"/>
+      <w:pPr>
+        <w:tabs>
+          <w:tab w:val="num" w:pos="2880"/>
+        </w:tabs>
+        <w:ind w:left="2880" w:hanging="360"/>
+      </w:pPr>
+    </w:lvl>
+    <w:lvl w:ilvl="4" w:tentative="1">
+      <w:start w:val="1"/>
+      <w:numFmt w:val="decimal"/>
+      <w:lvlText w:val="%5."/>
+      <w:lvlJc w:val="left"/>
+      <w:pPr>
+        <w:tabs>
+          <w:tab w:val="num" w:pos="3600"/>
+        </w:tabs>
+        <w:ind w:left="3600" w:hanging="360"/>
+      </w:pPr>
+    </w:lvl>
+    <w:lvl w:ilvl="5" w:tentative="1">
+      <w:start w:val="1"/>
+      <w:numFmt w:val="decimal"/>
+      <w:lvlText w:val="%6."/>
+      <w:lvlJc w:val="left"/>
+      <w:pPr>
+        <w:tabs>
+          <w:tab w:val="num" w:pos="4320"/>
+        </w:tabs>
+        <w:ind w:left="4320" w:hanging="360"/>
+      </w:pPr>
+    </w:lvl>
+    <w:lvl w:ilvl="6" w:tentative="1">
+      <w:start w:val="1"/>
+      <w:numFmt w:val="decimal"/>
+      <w:lvlText w:val="%7."/>
+      <w:lvlJc w:val="left"/>
+      <w:pPr>
+        <w:tabs>
+          <w:tab w:val="num" w:pos="5040"/>
+        </w:tabs>
+        <w:ind w:left="5040" w:hanging="360"/>
+      </w:pPr>
+    </w:lvl>
+    <w:lvl w:ilvl="7" w:tentative="1">
+      <w:start w:val="1"/>
+      <w:numFmt w:val="decimal"/>
+      <w:lvlText w:val="%8."/>
+      <w:lvlJc w:val="left"/>
+      <w:pPr>
+        <w:tabs>
+          <w:tab w:val="num" w:pos="5760"/>
+        </w:tabs>
+        <w:ind w:left="5760" w:hanging="360"/>
+      </w:pPr>
+    </w:lvl>
+    <w:lvl w:ilvl="8" w:tentative="1">
+      <w:start w:val="1"/>
+      <w:numFmt w:val="decimal"/>
+      <w:lvlText w:val="%9."/>
+      <w:lvlJc w:val="left"/>
+      <w:pPr>
+        <w:tabs>
+          <w:tab w:val="num" w:pos="6480"/>
+        </w:tabs>
+        <w:ind w:left="6480" w:hanging="360"/>
+      </w:pPr>
+    </w:lvl>
+  </w:abstractNum>
+  <w:abstractNum w:abstractNumId="1" w15:restartNumberingAfterBreak="0">
+    <w:nsid w:val="226B226C"/>
+    <w:multiLevelType w:val="multilevel"/>
+    <w:tmpl w:val="C4B87B7A"/>
+    <w:lvl w:ilvl="0">
+      <w:start w:val="1"/>
+      <w:numFmt w:val="bullet"/>
+      <w:lvlText w:val=""/>
+      <w:lvlJc w:val="left"/>
+      <w:pPr>
+        <w:tabs>
+          <w:tab w:val="num" w:pos="720"/>
+        </w:tabs>
+        <w:ind w:left="720" w:hanging="360"/>
+      </w:pPr>
+      <w:rPr>
+        <w:rFonts w:ascii="Symbol" w:hAnsi="Symbol" w:hint="default"/>
+      </w:rPr>
+    </w:lvl>
+    <w:lvl w:ilvl="1" w:tentative="1">
+      <w:start w:val="1"/>
+      <w:numFmt w:val="decimal"/>
+      <w:lvlText w:val="%2."/>
+      <w:lvlJc w:val="left"/>
+      <w:pPr>
+        <w:tabs>
+          <w:tab w:val="num" w:pos="1440"/>
+        </w:tabs>
+        <w:ind w:left="1440" w:hanging="360"/>
+      </w:pPr>
+    </w:lvl>
+    <w:lvl w:ilvl="2" w:tentative="1">
+      <w:start w:val="1"/>
+      <w:numFmt w:val="decimal"/>
+      <w:lvlText w:val="%3."/>
+      <w:lvlJc w:val="left"/>
+      <w:pPr>
+        <w:tabs>
+          <w:tab w:val="num" w:pos="2160"/>
+        </w:tabs>
+        <w:ind w:left="2160" w:hanging="360"/>
+      </w:pPr>
+    </w:lvl>
+    <w:lvl w:ilvl="3" w:tentative="1">
+      <w:start w:val="1"/>
+      <w:numFmt w:val="decimal"/>
+      <w:lvlText w:val="%4."/>
+      <w:lvlJc w:val="left"/>
+      <w:pPr>
+        <w:tabs>
+          <w:tab w:val="num" w:pos="2880"/>
+        </w:tabs>
+        <w:ind w:left="2880" w:hanging="360"/>
+      </w:pPr>
+    </w:lvl>
+    <w:lvl w:ilvl="4" w:tentative="1">
+      <w:start w:val="1"/>
+      <w:numFmt w:val="decimal"/>
+      <w:lvlText w:val="%5."/>
+      <w:lvlJc w:val="left"/>
+      <w:pPr>
+        <w:tabs>
+          <w:tab w:val="num" w:pos="3600"/>
+        </w:tabs>
+        <w:ind w:left="3600" w:hanging="360"/>
+      </w:pPr>
+    </w:lvl>
+    <w:lvl w:ilvl="5" w:tentative="1">
+      <w:start w:val="1"/>
+      <w:numFmt w:val="decimal"/>
+      <w:lvlText w:val="%6."/>
+      <w:lvlJc w:val="left"/>
+      <w:pPr>
+        <w:tabs>
+          <w:tab w:val="num" w:pos="4320"/>
+        </w:tabs>
+        <w:ind w:left="4320" w:hanging="360"/>
+      </w:pPr>
+    </w:lvl>
+    <w:lvl w:ilvl="6" w:tentative="1">
+      <w:start w:val="1"/>
+      <w:numFmt w:val="decimal"/>
+      <w:lvlText w:val="%7."/>
+      <w:lvlJc w:val="left"/>
+      <w:pPr>
+        <w:tabs>
+          <w:tab w:val="num" w:pos="5040"/>
+        </w:tabs>
+        <w:ind w:left="5040" w:hanging="360"/>
+      </w:pPr>
+    </w:lvl>
+    <w:lvl w:ilvl="7" w:tentative="1">
+      <w:start w:val="1"/>
+      <w:numFmt w:val="decimal"/>
+      <w:lvlText w:val="%8."/>
+      <w:lvlJc w:val="left"/>
+      <w:pPr>
+        <w:tabs>
+          <w:tab w:val="num" w:pos="5760"/>
+        </w:tabs>
+        <w:ind w:left="5760" w:hanging="360"/>
+      </w:pPr>
+    </w:lvl>
+    <w:lvl w:ilvl="8" w:tentative="1">
+      <w:start w:val="1"/>
+      <w:numFmt w:val="decimal"/>
+      <w:lvlText w:val="%9."/>
+      <w:lvlJc w:val="left"/>
+      <w:pPr>
+        <w:tabs>
+          <w:tab w:val="num" w:pos="6480"/>
+        </w:tabs>
+        <w:ind w:left="6480" w:hanging="360"/>
+      </w:pPr>
+    </w:lvl>
+  </w:abstractNum>
+  <w:abstractNum w:abstractNumId="2" w15:restartNumberingAfterBreak="0">
+    <w:nsid w:val="46265C0D"/>
+    <w:multiLevelType w:val="multilevel"/>
+    <w:tmpl w:val="5D84EB2A"/>
+    <w:lvl w:ilvl="0">
+      <w:start w:val="1"/>
+      <w:numFmt w:val="bullet"/>
+      <w:lvlText w:val=""/>
+      <w:lvlJc w:val="left"/>
+      <w:pPr>
+        <w:tabs>
+          <w:tab w:val="num" w:pos="720"/>
+        </w:tabs>
+        <w:ind w:left="720" w:hanging="360"/>
+      </w:pPr>
+      <w:rPr>
+        <w:rFonts w:ascii="Symbol" w:hAnsi="Symbol" w:hint="default"/>
+        <w:sz w:val="20"/>
+      </w:rPr>
+    </w:lvl>
+    <w:lvl w:ilvl="1" w:tentative="1">
+      <w:start w:val="1"/>
+      <w:numFmt w:val="bullet"/>
+      <w:lvlText w:val="o"/>
+      <w:lvlJc w:val="left"/>
+      <w:pPr>
+        <w:tabs>
+          <w:tab w:val="num" w:pos="1440"/>
+        </w:tabs>
+        <w:ind w:left="1440" w:hanging="360"/>
+      </w:pPr>
+      <w:rPr>
+        <w:rFonts w:ascii="Courier New" w:hAnsi="Courier New" w:hint="default"/>
+        <w:sz w:val="20"/>
+      </w:rPr>
+    </w:lvl>
+    <w:lvl w:ilvl="2" w:tentative="1">
+      <w:start w:val="1"/>
+      <w:numFmt w:val="bullet"/>
+      <w:lvlText w:val=""/>
+      <w:lvlJc w:val="left"/>
+      <w:pPr>
+        <w:tabs>
+          <w:tab w:val="num" w:pos="2160"/>
+        </w:tabs>
+        <w:ind w:left="2160" w:hanging="360"/>
+      </w:pPr>
+      <w:rPr>
+        <w:rFonts w:ascii="Wingdings" w:hAnsi="Wingdings" w:hint="default"/>
+        <w:sz w:val="20"/>
+      </w:rPr>
+    </w:lvl>
+    <w:lvl w:ilvl="3" w:tentative="1">
+      <w:start w:val="1"/>
+      <w:numFmt w:val="bullet"/>
+      <w:lvlText w:val=""/>
+      <w:lvlJc w:val="left"/>
+      <w:pPr>
+        <w:tabs>
+          <w:tab w:val="num" w:pos="2880"/>
+        </w:tabs>
+        <w:ind w:left="2880" w:hanging="360"/>
+      </w:pPr>
+      <w:rPr>
+        <w:rFonts w:ascii="Wingdings" w:hAnsi="Wingdings" w:hint="default"/>
+        <w:sz w:val="20"/>
+      </w:rPr>
+    </w:lvl>
+    <w:lvl w:ilvl="4" w:tentative="1">
+      <w:start w:val="1"/>
+      <w:numFmt w:val="bullet"/>
+      <w:lvlText w:val=""/>
+      <w:lvlJc w:val="left"/>
+      <w:pPr>
+        <w:tabs>
+          <w:tab w:val="num" w:pos="3600"/>
+        </w:tabs>
+        <w:ind w:left="3600" w:hanging="360"/>
+      </w:pPr>
+      <w:rPr>
+        <w:rFonts w:ascii="Wingdings" w:hAnsi="Wingdings" w:hint="default"/>
+        <w:sz w:val="20"/>
+      </w:rPr>
+    </w:lvl>
+    <w:lvl w:ilvl="5" w:tentative="1">
+      <w:start w:val="1"/>
+      <w:numFmt w:val="bullet"/>
+      <w:lvlText w:val=""/>
+      <w:lvlJc w:val="left"/>
+      <w:pPr>
+        <w:tabs>
+          <w:tab w:val="num" w:pos="4320"/>
+        </w:tabs>
+        <w:ind w:left="4320" w:hanging="360"/>
+      </w:pPr>
+      <w:rPr>
+        <w:rFonts w:ascii="Wingdings" w:hAnsi="Wingdings" w:hint="default"/>
+        <w:sz w:val="20"/>
+      </w:rPr>
+    </w:lvl>
+    <w:lvl w:ilvl="6" w:tentative="1">
+      <w:start w:val="1"/>
+      <w:numFmt w:val="bullet"/>
+      <w:lvlText w:val=""/>
+      <w:lvlJc w:val="left"/>
+      <w:pPr>
+        <w:tabs>
+          <w:tab w:val="num" w:pos="5040"/>
+        </w:tabs>
+        <w:ind w:left="5040" w:hanging="360"/>
+      </w:pPr>
+      <w:rPr>
+        <w:rFonts w:ascii="Wingdings" w:hAnsi="Wingdings" w:hint="default"/>
+        <w:sz w:val="20"/>
+      </w:rPr>
+    </w:lvl>
+    <w:lvl w:ilvl="7" w:tentative="1">
+      <w:start w:val="1"/>
+      <w:numFmt w:val="bullet"/>
+      <w:lvlText w:val=""/>
+      <w:lvlJc w:val="left"/>
+      <w:pPr>
+        <w:tabs>
+          <w:tab w:val="num" w:pos="5760"/>
+        </w:tabs>
+        <w:ind w:left="5760" w:hanging="360"/>
+      </w:pPr>
+      <w:rPr>
+        <w:rFonts w:ascii="Wingdings" w:hAnsi="Wingdings" w:hint="default"/>
+        <w:sz w:val="20"/>
+      </w:rPr>
+    </w:lvl>
+    <w:lvl w:ilvl="8" w:tentative="1">
+      <w:start w:val="1"/>
+      <w:numFmt w:val="bullet"/>
+      <w:lvlText w:val=""/>
+      <w:lvlJc w:val="left"/>
+      <w:pPr>
+        <w:tabs>
+          <w:tab w:val="num" w:pos="6480"/>
+        </w:tabs>
+        <w:ind w:left="6480" w:hanging="360"/>
+      </w:pPr>
+      <w:rPr>
+        <w:rFonts w:ascii="Wingdings" w:hAnsi="Wingdings" w:hint="default"/>
+        <w:sz w:val="20"/>
+      </w:rPr>
+    </w:lvl>
+  </w:abstractNum>
+  <w:abstractNum w:abstractNumId="3" w15:restartNumberingAfterBreak="0">
+    <w:nsid w:val="4E4C75E0"/>
+    <w:multiLevelType w:val="hybridMultilevel"/>
+    <w:tmpl w:val="A2F4D890"/>
+    <w:lvl w:ilvl="0" w:tplc="04090001">
+      <w:start w:val="1"/>
+      <w:numFmt w:val="bullet"/>
+      <w:lvlText w:val=""/>
+      <w:lvlJc w:val="left"/>
+      <w:pPr>
+        <w:ind w:left="720" w:hanging="360"/>
+      </w:pPr>
+      <w:rPr>
+        <w:rFonts w:ascii="Symbol" w:hAnsi="Symbol" w:hint="default"/>
+      </w:rPr>
+    </w:lvl>
+    <w:lvl w:ilvl="1" w:tplc="04090003" w:tentative="1">
+      <w:start w:val="1"/>
+      <w:numFmt w:val="bullet"/>
+      <w:lvlText w:val="o"/>
+      <w:lvlJc w:val="left"/>
+      <w:pPr>
+        <w:ind w:left="1440" w:hanging="360"/>
+      </w:pPr>
+      <w:rPr>
+        <w:rFonts w:ascii="Courier New" w:hAnsi="Courier New" w:cs="Courier New" w:hint="default"/>
+      </w:rPr>
+    </w:lvl>
+    <w:lvl w:ilvl="2" w:tplc="04090005" w:tentative="1">
+      <w:start w:val="1"/>
+      <w:numFmt w:val="bullet"/>
+      <w:lvlText w:val=""/>
+      <w:lvlJc w:val="left"/>
+      <w:pPr>
+        <w:ind w:left="2160" w:hanging="360"/>
+      </w:pPr>
+      <w:rPr>
+        <w:rFonts w:ascii="Wingdings" w:hAnsi="Wingdings" w:hint="default"/>
+      </w:rPr>
+    </w:lvl>
+    <w:lvl w:ilvl="3" w:tplc="04090001" w:tentative="1">
+      <w:start w:val="1"/>
+      <w:numFmt w:val="bullet"/>
+      <w:lvlText w:val=""/>
+      <w:lvlJc w:val="left"/>
+      <w:pPr>
+        <w:ind w:left="2880" w:hanging="360"/>
+      </w:pPr>
+      <w:rPr>
+        <w:rFonts w:ascii="Symbol" w:hAnsi="Symbol" w:hint="default"/>
+      </w:rPr>
+    </w:lvl>
+    <w:lvl w:ilvl="4" w:tplc="04090003" w:tentative="1">
+      <w:start w:val="1"/>
+      <w:numFmt w:val="bullet"/>
+      <w:lvlText w:val="o"/>
+      <w:lvlJc w:val="left"/>
+      <w:pPr>
+        <w:ind w:left="3600" w:hanging="360"/>
+      </w:pPr>
+      <w:rPr>
+        <w:rFonts w:ascii="Courier New" w:hAnsi="Courier New" w:cs="Courier New" w:hint="default"/>
+      </w:rPr>
+    </w:lvl>
+    <w:lvl w:ilvl="5" w:tplc="04090005" w:tentative="1">
+      <w:start w:val="1"/>
+      <w:numFmt w:val="bullet"/>
+      <w:lvlText w:val=""/>
+      <w:lvlJc w:val="left"/>
+      <w:pPr>
+        <w:ind w:left="4320" w:hanging="360"/>
+      </w:pPr>
+      <w:rPr>
+        <w:rFonts w:ascii="Wingdings" w:hAnsi="Wingdings" w:hint="default"/>
+      </w:rPr>
+    </w:lvl>
+    <w:lvl w:ilvl="6" w:tplc="04090001" w:tentative="1">
+      <w:start w:val="1"/>
+      <w:numFmt w:val="bullet"/>
+      <w:lvlText w:val=""/>
+      <w:lvlJc w:val="left"/>
+      <w:pPr>
+        <w:ind w:left="5040" w:hanging="360"/>
+      </w:pPr>
+      <w:rPr>
+        <w:rFonts w:ascii="Symbol" w:hAnsi="Symbol" w:hint="default"/>
+      </w:rPr>
+    </w:lvl>
+    <w:lvl w:ilvl="7" w:tplc="04090003" w:tentative="1">
+      <w:start w:val="1"/>
+      <w:numFmt w:val="bullet"/>
+      <w:lvlText w:val="o"/>
+      <w:lvlJc w:val="left"/>
+      <w:pPr>
+        <w:ind w:left="5760" w:hanging="360"/>
+      </w:pPr>
+      <w:rPr>
+        <w:rFonts w:ascii="Courier New" w:hAnsi="Courier New" w:cs="Courier New" w:hint="default"/>
+      </w:rPr>
+    </w:lvl>
+    <w:lvl w:ilvl="8" w:tplc="04090005" w:tentative="1">
+      <w:start w:val="1"/>
+      <w:numFmt w:val="bullet"/>
+      <w:lvlText w:val=""/>
+      <w:lvlJc w:val="left"/>
+      <w:pPr>
+        <w:ind w:left="6480" w:hanging="360"/>
+      </w:pPr>
+      <w:rPr>
+        <w:rFonts w:ascii="Wingdings" w:hAnsi="Wingdings" w:hint="default"/>
+      </w:rPr>
+    </w:lvl>
+  </w:abstractNum>
+  <w:abstractNum w:abstractNumId="4" w15:restartNumberingAfterBreak="0">
+    <w:nsid w:val="50D42750"/>
+    <w:multiLevelType w:val="multilevel"/>
+    <w:tmpl w:val="E5A80478"/>
+    <w:lvl w:ilvl="0">
+      <w:start w:val="1"/>
+      <w:numFmt w:val="bullet"/>
+      <w:lvlText w:val=""/>
+      <w:lvlJc w:val="left"/>
+      <w:pPr>
+        <w:tabs>
+          <w:tab w:val="num" w:pos="720"/>
+        </w:tabs>
+        <w:ind w:left="720" w:hanging="360"/>
+      </w:pPr>
+      <w:rPr>
+        <w:rFonts w:ascii="Symbol" w:hAnsi="Symbol" w:hint="default"/>
+        <w:sz w:val="20"/>
+      </w:rPr>
+    </w:lvl>
+    <w:lvl w:ilvl="1" w:tentative="1">
+      <w:start w:val="1"/>
+      <w:numFmt w:val="bullet"/>
+      <w:lvlText w:val="o"/>
+      <w:lvlJc w:val="left"/>
+      <w:pPr>
+        <w:tabs>
+          <w:tab w:val="num" w:pos="1440"/>
+        </w:tabs>
+        <w:ind w:left="1440" w:hanging="360"/>
+      </w:pPr>
+      <w:rPr>
+        <w:rFonts w:ascii="Courier New" w:hAnsi="Courier New" w:hint="default"/>
+        <w:sz w:val="20"/>
+      </w:rPr>
+    </w:lvl>
+    <w:lvl w:ilvl="2" w:tentative="1">
+      <w:start w:val="1"/>
+      <w:numFmt w:val="bullet"/>
+      <w:lvlText w:val=""/>
+      <w:lvlJc w:val="left"/>
+      <w:pPr>
+        <w:tabs>
+          <w:tab w:val="num" w:pos="2160"/>
+        </w:tabs>
+        <w:ind w:left="2160" w:hanging="360"/>
+      </w:pPr>
+      <w:rPr>
+        <w:rFonts w:ascii="Wingdings" w:hAnsi="Wingdings" w:hint="default"/>
+        <w:sz w:val="20"/>
+      </w:rPr>
+    </w:lvl>
+    <w:lvl w:ilvl="3" w:tentative="1">
+      <w:start w:val="1"/>
+      <w:numFmt w:val="bullet"/>
+      <w:lvlText w:val=""/>
+      <w:lvlJc w:val="left"/>
+      <w:pPr>
+        <w:tabs>
+          <w:tab w:val="num" w:pos="2880"/>
+        </w:tabs>
+        <w:ind w:left="2880" w:hanging="360"/>
+      </w:pPr>
+      <w:rPr>
+        <w:rFonts w:ascii="Wingdings" w:hAnsi="Wingdings" w:hint="default"/>
+        <w:sz w:val="20"/>
+      </w:rPr>
+    </w:lvl>
+    <w:lvl w:ilvl="4" w:tentative="1">
+      <w:start w:val="1"/>
+      <w:numFmt w:val="bullet"/>
+      <w:lvlText w:val=""/>
+      <w:lvlJc w:val="left"/>
+      <w:pPr>
+        <w:tabs>
+          <w:tab w:val="num" w:pos="3600"/>
+        </w:tabs>
+        <w:ind w:left="3600" w:hanging="360"/>
+      </w:pPr>
+      <w:rPr>
+        <w:rFonts w:ascii="Wingdings" w:hAnsi="Wingdings" w:hint="default"/>
+        <w:sz w:val="20"/>
+      </w:rPr>
+    </w:lvl>
+    <w:lvl w:ilvl="5" w:tentative="1">
+      <w:start w:val="1"/>
+      <w:numFmt w:val="bullet"/>
+      <w:lvlText w:val=""/>
+      <w:lvlJc w:val="left"/>
+      <w:pPr>
+        <w:tabs>
+          <w:tab w:val="num" w:pos="4320"/>
+        </w:tabs>
+        <w:ind w:left="4320" w:hanging="360"/>
+      </w:pPr>
+      <w:rPr>
+        <w:rFonts w:ascii="Wingdings" w:hAnsi="Wingdings" w:hint="default"/>
+        <w:sz w:val="20"/>
+      </w:rPr>
+    </w:lvl>
+    <w:lvl w:ilvl="6" w:tentative="1">
+      <w:start w:val="1"/>
+      <w:numFmt w:val="bullet"/>
+      <w:lvlText w:val=""/>
+      <w:lvlJc w:val="left"/>
+      <w:pPr>
+        <w:tabs>
+          <w:tab w:val="num" w:pos="5040"/>
+        </w:tabs>
+        <w:ind w:left="5040" w:hanging="360"/>
+      </w:pPr>
+      <w:rPr>
+        <w:rFonts w:ascii="Wingdings" w:hAnsi="Wingdings" w:hint="default"/>
+        <w:sz w:val="20"/>
+      </w:rPr>
+    </w:lvl>
+    <w:lvl w:ilvl="7" w:tentative="1">
+      <w:start w:val="1"/>
+      <w:numFmt w:val="bullet"/>
+      <w:lvlText w:val=""/>
+      <w:lvlJc w:val="left"/>
+      <w:pPr>
+        <w:tabs>
+          <w:tab w:val="num" w:pos="5760"/>
+        </w:tabs>
+        <w:ind w:left="5760" w:hanging="360"/>
+      </w:pPr>
+      <w:rPr>
+        <w:rFonts w:ascii="Wingdings" w:hAnsi="Wingdings" w:hint="default"/>
+        <w:sz w:val="20"/>
+      </w:rPr>
+    </w:lvl>
+    <w:lvl w:ilvl="8" w:tentative="1">
+      <w:start w:val="1"/>
+      <w:numFmt w:val="bullet"/>
+      <w:lvlText w:val=""/>
+      <w:lvlJc w:val="left"/>
+      <w:pPr>
+        <w:tabs>
+          <w:tab w:val="num" w:pos="6480"/>
+        </w:tabs>
+        <w:ind w:left="6480" w:hanging="360"/>
+      </w:pPr>
+      <w:rPr>
+        <w:rFonts w:ascii="Wingdings" w:hAnsi="Wingdings" w:hint="default"/>
+        <w:sz w:val="20"/>
+      </w:rPr>
+    </w:lvl>
+  </w:abstractNum>
+  <w:abstractNum w:abstractNumId="5" w15:restartNumberingAfterBreak="0">
+    <w:nsid w:val="6B3644FF"/>
+    <w:multiLevelType w:val="multilevel"/>
+    <w:tmpl w:val="76EA844C"/>
+    <w:lvl w:ilvl="0">
+      <w:start w:val="1"/>
+      <w:numFmt w:val="decimal"/>
+      <w:lvlText w:val="%1."/>
+      <w:lvlJc w:val="left"/>
+      <w:pPr>
+        <w:tabs>
+          <w:tab w:val="num" w:pos="720"/>
+        </w:tabs>
+        <w:ind w:left="720" w:hanging="360"/>
+      </w:pPr>
+    </w:lvl>
+    <w:lvl w:ilvl="1" w:tentative="1">
+      <w:start w:val="1"/>
+      <w:numFmt w:val="decimal"/>
+      <w:lvlText w:val="%2."/>
+      <w:lvlJc w:val="left"/>
+      <w:pPr>
+        <w:tabs>
+          <w:tab w:val="num" w:pos="1440"/>
+        </w:tabs>
+        <w:ind w:left="1440" w:hanging="360"/>
+      </w:pPr>
+    </w:lvl>
+    <w:lvl w:ilvl="2" w:tentative="1">
+      <w:start w:val="1"/>
+      <w:numFmt w:val="decimal"/>
+      <w:lvlText w:val="%3."/>
+      <w:lvlJc w:val="left"/>
+      <w:pPr>
+        <w:tabs>
+          <w:tab w:val="num" w:pos="2160"/>
+        </w:tabs>
+        <w:ind w:left="2160" w:hanging="360"/>
+      </w:pPr>
+    </w:lvl>
+    <w:lvl w:ilvl="3" w:tentative="1">
+      <w:start w:val="1"/>
+      <w:numFmt w:val="decimal"/>
+      <w:lvlText w:val="%4."/>
+      <w:lvlJc w:val="left"/>
+      <w:pPr>
+        <w:tabs>
+          <w:tab w:val="num" w:pos="2880"/>
+        </w:tabs>
+        <w:ind w:left="2880" w:hanging="360"/>
+      </w:pPr>
+    </w:lvl>
+    <w:lvl w:ilvl="4" w:tentative="1">
+      <w:start w:val="1"/>
+      <w:numFmt w:val="decimal"/>
+      <w:lvlText w:val="%5."/>
+      <w:lvlJc w:val="left"/>
+      <w:pPr>
+        <w:tabs>
+          <w:tab w:val="num" w:pos="3600"/>
+        </w:tabs>
+        <w:ind w:left="3600" w:hanging="360"/>
+      </w:pPr>
+    </w:lvl>
+    <w:lvl w:ilvl="5" w:tentative="1">
+      <w:start w:val="1"/>
+      <w:numFmt w:val="decimal"/>
+      <w:lvlText w:val="%6."/>
+      <w:lvlJc w:val="left"/>
+      <w:pPr>
+        <w:tabs>
+          <w:tab w:val="num" w:pos="4320"/>
+        </w:tabs>
+        <w:ind w:left="4320" w:hanging="360"/>
+      </w:pPr>
+    </w:lvl>
+    <w:lvl w:ilvl="6" w:tentative="1">
+      <w:start w:val="1"/>
+      <w:numFmt w:val="decimal"/>
+      <w:lvlText w:val="%7."/>
+      <w:lvlJc w:val="left"/>
+      <w:pPr>
+        <w:tabs>
+          <w:tab w:val="num" w:pos="5040"/>
+        </w:tabs>
+        <w:ind w:left="5040" w:hanging="360"/>
+      </w:pPr>
+    </w:lvl>
+    <w:lvl w:ilvl="7" w:tentative="1">
+      <w:start w:val="1"/>
+      <w:numFmt w:val="decimal"/>
+      <w:lvlText w:val="%8."/>
+      <w:lvlJc w:val="left"/>
+      <w:pPr>
+        <w:tabs>
+          <w:tab w:val="num" w:pos="5760"/>
+        </w:tabs>
+        <w:ind w:left="5760" w:hanging="360"/>
+      </w:pPr>
+    </w:lvl>
+    <w:lvl w:ilvl="8" w:tentative="1">
+      <w:start w:val="1"/>
+      <w:numFmt w:val="decimal"/>
+      <w:lvlText w:val="%9."/>
+      <w:lvlJc w:val="left"/>
+      <w:pPr>
+        <w:tabs>
+          <w:tab w:val="num" w:pos="6480"/>
+        </w:tabs>
+        <w:ind w:left="6480" w:hanging="360"/>
+      </w:pPr>
+    </w:lvl>
+  </w:abstractNum>
+  <w:num w:numId="1" w16cid:durableId="1604456178">
+    <w:abstractNumId w:val="5"/>
+  </w:num>
+  <w:num w:numId="2" w16cid:durableId="638650503">
+    <w:abstractNumId w:val="3"/>
+  </w:num>
+  <w:num w:numId="3" w16cid:durableId="1905681771">
+    <w:abstractNumId w:val="0"/>
+  </w:num>
+  <w:num w:numId="4" w16cid:durableId="1350371814">
+    <w:abstractNumId w:val="1"/>
+  </w:num>
+  <w:num w:numId="5" w16cid:durableId="876888807">
+    <w:abstractNumId w:val="2"/>
+  </w:num>
+  <w:num w:numId="6" w16cid:durableId="1665355211">
+    <w:abstractNumId w:val="4"/>
+  </w:num>
+</w:numbering>
 </file>
 
 <file path=word/styles.xml><?xml version="1.0" encoding="utf-8"?>
@@ -826,7 +2674,6 @@
   <w:style w:type="character" w:default="1" w:styleId="DefaultParagraphFont">
     <w:name w:val="Default Paragraph Font"/>
     <w:uiPriority w:val="1"/>
-    <w:semiHidden/>
     <w:unhideWhenUsed/>
   </w:style>
   <w:style w:type="table" w:default="1" w:styleId="TableNormal">

</xml_diff>